<commit_message>
supabase auth part 1
</commit_message>
<xml_diff>
--- a/documents/Tudástér speciikáció.docx
+++ b/documents/Tudástér speciikáció.docx
@@ -2510,13 +2510,7 @@
         </w:numPr>
       </w:pPr>
       <w:r>
-        <w:t xml:space="preserve">Projekt neve: </w:t>
-      </w:r>
-      <w:r>
-        <w:t>Tudástér</w:t>
-      </w:r>
-      <w:r>
-        <w:t xml:space="preserve"> </w:t>
+        <w:t xml:space="preserve">Projekt neve: Tudástér </w:t>
       </w:r>
     </w:p>
     <w:p>
@@ -2528,13 +2522,7 @@
         </w:numPr>
       </w:pPr>
       <w:r>
-        <w:t>F</w:t>
-      </w:r>
-      <w:r>
-        <w:t xml:space="preserve">eladat rövid ismertetése: </w:t>
-      </w:r>
-      <w:r>
-        <w:t>Érettségire való digitális ineteraktív felkészülés biztosít a Tudástér</w:t>
+        <w:t>Feladat rövid ismertetése: Érettségire való digitális ineteraktív felkészülés biztosít a Tudástér</w:t>
       </w:r>
     </w:p>
     <w:p>
@@ -2546,28 +2534,7 @@
         </w:numPr>
       </w:pPr>
       <w:r>
-        <w:t xml:space="preserve">Felhasznált </w:t>
-      </w:r>
-      <w:r>
-        <w:t>technológiák</w:t>
-      </w:r>
-      <w:r>
-        <w:t xml:space="preserve">: React </w:t>
-      </w:r>
-      <w:r>
-        <w:t>(</w:t>
-      </w:r>
-      <w:r>
-        <w:t>Vite fejlesztői környezet</w:t>
-      </w:r>
-      <w:r>
-        <w:t xml:space="preserve">), </w:t>
-      </w:r>
-      <w:r>
-        <w:t xml:space="preserve"> Node.js és kiegészítő könyvtárak</w:t>
-      </w:r>
-      <w:r>
-        <w:t>, PostgreSQL, C#</w:t>
+        <w:t>Felhasznált technológiák: React (Vite fejlesztői környezet),  Node.js és kiegészítő könyvtárak, PostgreSQL, C#</w:t>
       </w:r>
     </w:p>
     <w:p>
@@ -2579,18 +2546,16 @@
         </w:numPr>
       </w:pPr>
       <w:r>
-        <w:t>Specifikációt összeállította: Szabó Gábor Ferenc, Csörögi Gyula</w:t>
-      </w:r>
-      <w:r>
-        <w:t xml:space="preserve"> </w:t>
-      </w:r>
-      <w:r>
-        <w:t>Attila, Apáti László</w:t>
+        <w:t>Specifikációt összeállította: Szabó Gábor Ferenc, Csörögi Gyula Attila, Apáti László</w:t>
       </w:r>
     </w:p>
     <w:sectPr>
-      <w:headerReference w:type="default" r:id="rId10"/>
-      <w:footerReference w:type="default" r:id="rId11"/>
+      <w:headerReference w:type="even" r:id="rId10"/>
+      <w:headerReference w:type="default" r:id="rId11"/>
+      <w:footerReference w:type="even" r:id="rId12"/>
+      <w:footerReference w:type="default" r:id="rId13"/>
+      <w:headerReference w:type="first" r:id="rId14"/>
+      <w:footerReference w:type="first" r:id="rId15"/>
       <w:pgSz w:w="11906" w:h="16838"/>
       <w:pgMar w:top="1736" w:right="1274" w:bottom="1134" w:left="1276" w:header="709" w:footer="709" w:gutter="0"/>
       <w:cols w:space="708"/>
@@ -2627,6 +2592,16 @@
 </file>
 
 <file path=word/footer1.xml><?xml version="1.0" encoding="utf-8"?>
+<w:ftr xmlns:wpc="http://schemas.microsoft.com/office/word/2010/wordprocessingCanvas" xmlns:cx="http://schemas.microsoft.com/office/drawing/2014/chartex" xmlns:cx1="http://schemas.microsoft.com/office/drawing/2015/9/8/chartex" xmlns:cx2="http://schemas.microsoft.com/office/drawing/2015/10/21/chartex" xmlns:cx3="http://schemas.microsoft.com/office/drawing/2016/5/9/chartex" xmlns:cx4="http://schemas.microsoft.com/office/drawing/2016/5/10/chartex" xmlns:cx5="http://schemas.microsoft.com/office/drawing/2016/5/11/chartex" xmlns:cx6="http://schemas.microsoft.com/office/drawing/2016/5/12/chartex" xmlns:cx7="http://schemas.microsoft.com/office/drawing/2016/5/13/chartex" xmlns:cx8="http://schemas.microsoft.com/office/drawing/2016/5/14/chartex" xmlns:mc="http://schemas.openxmlformats.org/markup-compatibility/2006" xmlns:aink="http://schemas.microsoft.com/office/drawing/2016/ink" xmlns:am3d="http://schemas.microsoft.com/office/drawing/2017/model3d" xmlns:o="urn:schemas-microsoft-com:office:office" xmlns:r="http://schemas.openxmlformats.org/officeDocument/2006/relationships" xmlns:m="http://schemas.openxmlformats.org/officeDocument/2006/math" xmlns:v="urn:schemas-microsoft-com:vml" xmlns:wp14="http://schemas.microsoft.com/office/word/2010/wordprocessingDrawing" xmlns:wp="http://schemas.openxmlformats.org/drawingml/2006/wordprocessingDrawing" xmlns:w10="urn:schemas-microsoft-com:office:word" xmlns:w="http://schemas.openxmlformats.org/wordprocessingml/2006/main" xmlns:w14="http://schemas.microsoft.com/office/word/2010/wordml" xmlns:w15="http://schemas.microsoft.com/office/word/2012/wordml" xmlns:w16cex="http://schemas.microsoft.com/office/word/2018/wordml/cex" xmlns:w16cid="http://schemas.microsoft.com/office/word/2016/wordml/cid" xmlns:w16="http://schemas.microsoft.com/office/word/2018/wordml" xmlns:w16sdtdh="http://schemas.microsoft.com/office/word/2020/wordml/sdtdatahash" xmlns:w16se="http://schemas.microsoft.com/office/word/2015/wordml/symex" xmlns:wpg="http://schemas.microsoft.com/office/word/2010/wordprocessingGroup" xmlns:wpi="http://schemas.microsoft.com/office/word/2010/wordprocessingInk" xmlns:wne="http://schemas.microsoft.com/office/word/2006/wordml" xmlns:wps="http://schemas.microsoft.com/office/word/2010/wordprocessingShape" mc:Ignorable="w14 w15 w16se w16cid w16 w16cex w16sdtdh wp14">
+  <w:p>
+    <w:pPr>
+      <w:pStyle w:val="llb"/>
+    </w:pPr>
+  </w:p>
+</w:ftr>
+</file>
+
+<file path=word/footer2.xml><?xml version="1.0" encoding="utf-8"?>
 <w:ftr xmlns:wpc="http://schemas.microsoft.com/office/word/2010/wordprocessingCanvas" xmlns:cx="http://schemas.microsoft.com/office/drawing/2014/chartex" xmlns:cx1="http://schemas.microsoft.com/office/drawing/2015/9/8/chartex" xmlns:cx2="http://schemas.microsoft.com/office/drawing/2015/10/21/chartex" xmlns:cx3="http://schemas.microsoft.com/office/drawing/2016/5/9/chartex" xmlns:cx4="http://schemas.microsoft.com/office/drawing/2016/5/10/chartex" xmlns:cx5="http://schemas.microsoft.com/office/drawing/2016/5/11/chartex" xmlns:cx6="http://schemas.microsoft.com/office/drawing/2016/5/12/chartex" xmlns:cx7="http://schemas.microsoft.com/office/drawing/2016/5/13/chartex" xmlns:cx8="http://schemas.microsoft.com/office/drawing/2016/5/14/chartex" xmlns:mc="http://schemas.openxmlformats.org/markup-compatibility/2006" xmlns:aink="http://schemas.microsoft.com/office/drawing/2016/ink" xmlns:am3d="http://schemas.microsoft.com/office/drawing/2017/model3d" xmlns:o="urn:schemas-microsoft-com:office:office" xmlns:r="http://schemas.openxmlformats.org/officeDocument/2006/relationships" xmlns:m="http://schemas.openxmlformats.org/officeDocument/2006/math" xmlns:v="urn:schemas-microsoft-com:vml" xmlns:wp14="http://schemas.microsoft.com/office/word/2010/wordprocessingDrawing" xmlns:wp="http://schemas.openxmlformats.org/drawingml/2006/wordprocessingDrawing" xmlns:w10="urn:schemas-microsoft-com:office:word" xmlns:w="http://schemas.openxmlformats.org/wordprocessingml/2006/main" xmlns:w14="http://schemas.microsoft.com/office/word/2010/wordml" xmlns:w15="http://schemas.microsoft.com/office/word/2012/wordml" xmlns:w16cex="http://schemas.microsoft.com/office/word/2018/wordml/cex" xmlns:w16cid="http://schemas.microsoft.com/office/word/2016/wordml/cid" xmlns:w16="http://schemas.microsoft.com/office/word/2018/wordml" xmlns:w16sdtdh="http://schemas.microsoft.com/office/word/2020/wordml/sdtdatahash" xmlns:w16se="http://schemas.microsoft.com/office/word/2015/wordml/symex" xmlns:wpg="http://schemas.microsoft.com/office/word/2010/wordprocessingGroup" xmlns:wpi="http://schemas.microsoft.com/office/word/2010/wordprocessingInk" xmlns:wne="http://schemas.microsoft.com/office/word/2006/wordml" xmlns:wps="http://schemas.microsoft.com/office/word/2010/wordprocessingShape" mc:Ignorable="w14 w15 w16se w16cid w16 w16cex w16sdtdh wp14">
   <w:sdt>
     <w:sdtPr>
@@ -2702,6 +2677,16 @@
 </w:ftr>
 </file>
 
+<file path=word/footer3.xml><?xml version="1.0" encoding="utf-8"?>
+<w:ftr xmlns:wpc="http://schemas.microsoft.com/office/word/2010/wordprocessingCanvas" xmlns:cx="http://schemas.microsoft.com/office/drawing/2014/chartex" xmlns:cx1="http://schemas.microsoft.com/office/drawing/2015/9/8/chartex" xmlns:cx2="http://schemas.microsoft.com/office/drawing/2015/10/21/chartex" xmlns:cx3="http://schemas.microsoft.com/office/drawing/2016/5/9/chartex" xmlns:cx4="http://schemas.microsoft.com/office/drawing/2016/5/10/chartex" xmlns:cx5="http://schemas.microsoft.com/office/drawing/2016/5/11/chartex" xmlns:cx6="http://schemas.microsoft.com/office/drawing/2016/5/12/chartex" xmlns:cx7="http://schemas.microsoft.com/office/drawing/2016/5/13/chartex" xmlns:cx8="http://schemas.microsoft.com/office/drawing/2016/5/14/chartex" xmlns:mc="http://schemas.openxmlformats.org/markup-compatibility/2006" xmlns:aink="http://schemas.microsoft.com/office/drawing/2016/ink" xmlns:am3d="http://schemas.microsoft.com/office/drawing/2017/model3d" xmlns:o="urn:schemas-microsoft-com:office:office" xmlns:r="http://schemas.openxmlformats.org/officeDocument/2006/relationships" xmlns:m="http://schemas.openxmlformats.org/officeDocument/2006/math" xmlns:v="urn:schemas-microsoft-com:vml" xmlns:wp14="http://schemas.microsoft.com/office/word/2010/wordprocessingDrawing" xmlns:wp="http://schemas.openxmlformats.org/drawingml/2006/wordprocessingDrawing" xmlns:w10="urn:schemas-microsoft-com:office:word" xmlns:w="http://schemas.openxmlformats.org/wordprocessingml/2006/main" xmlns:w14="http://schemas.microsoft.com/office/word/2010/wordml" xmlns:w15="http://schemas.microsoft.com/office/word/2012/wordml" xmlns:w16cex="http://schemas.microsoft.com/office/word/2018/wordml/cex" xmlns:w16cid="http://schemas.microsoft.com/office/word/2016/wordml/cid" xmlns:w16="http://schemas.microsoft.com/office/word/2018/wordml" xmlns:w16sdtdh="http://schemas.microsoft.com/office/word/2020/wordml/sdtdatahash" xmlns:w16se="http://schemas.microsoft.com/office/word/2015/wordml/symex" xmlns:wpg="http://schemas.microsoft.com/office/word/2010/wordprocessingGroup" xmlns:wpi="http://schemas.microsoft.com/office/word/2010/wordprocessingInk" xmlns:wne="http://schemas.microsoft.com/office/word/2006/wordml" xmlns:wps="http://schemas.microsoft.com/office/word/2010/wordprocessingShape" mc:Ignorable="w14 w15 w16se w16cid w16 w16cex w16sdtdh wp14">
+  <w:p>
+    <w:pPr>
+      <w:pStyle w:val="llb"/>
+    </w:pPr>
+  </w:p>
+</w:ftr>
+</file>
+
 <file path=word/footnotes.xml><?xml version="1.0" encoding="utf-8"?>
 <w:footnotes xmlns:wpc="http://schemas.microsoft.com/office/word/2010/wordprocessingCanvas" xmlns:cx="http://schemas.microsoft.com/office/drawing/2014/chartex" xmlns:cx1="http://schemas.microsoft.com/office/drawing/2015/9/8/chartex" xmlns:cx2="http://schemas.microsoft.com/office/drawing/2015/10/21/chartex" xmlns:cx3="http://schemas.microsoft.com/office/drawing/2016/5/9/chartex" xmlns:cx4="http://schemas.microsoft.com/office/drawing/2016/5/10/chartex" xmlns:cx5="http://schemas.microsoft.com/office/drawing/2016/5/11/chartex" xmlns:cx6="http://schemas.microsoft.com/office/drawing/2016/5/12/chartex" xmlns:cx7="http://schemas.microsoft.com/office/drawing/2016/5/13/chartex" xmlns:cx8="http://schemas.microsoft.com/office/drawing/2016/5/14/chartex" xmlns:mc="http://schemas.openxmlformats.org/markup-compatibility/2006" xmlns:aink="http://schemas.microsoft.com/office/drawing/2016/ink" xmlns:am3d="http://schemas.microsoft.com/office/drawing/2017/model3d" xmlns:o="urn:schemas-microsoft-com:office:office" xmlns:r="http://schemas.openxmlformats.org/officeDocument/2006/relationships" xmlns:m="http://schemas.openxmlformats.org/officeDocument/2006/math" xmlns:v="urn:schemas-microsoft-com:vml" xmlns:wp14="http://schemas.microsoft.com/office/word/2010/wordprocessingDrawing" xmlns:wp="http://schemas.openxmlformats.org/drawingml/2006/wordprocessingDrawing" xmlns:w10="urn:schemas-microsoft-com:office:word" xmlns:w="http://schemas.openxmlformats.org/wordprocessingml/2006/main" xmlns:w14="http://schemas.microsoft.com/office/word/2010/wordml" xmlns:w15="http://schemas.microsoft.com/office/word/2012/wordml" xmlns:w16cex="http://schemas.microsoft.com/office/word/2018/wordml/cex" xmlns:w16cid="http://schemas.microsoft.com/office/word/2016/wordml/cid" xmlns:w16="http://schemas.microsoft.com/office/word/2018/wordml" xmlns:w16sdtdh="http://schemas.microsoft.com/office/word/2020/wordml/sdtdatahash" xmlns:w16se="http://schemas.microsoft.com/office/word/2015/wordml/symex" xmlns:wpg="http://schemas.microsoft.com/office/word/2010/wordprocessingGroup" xmlns:wpi="http://schemas.microsoft.com/office/word/2010/wordprocessingInk" xmlns:wne="http://schemas.microsoft.com/office/word/2006/wordml" xmlns:wps="http://schemas.microsoft.com/office/word/2010/wordprocessingShape" mc:Ignorable="w14 w15 w16se w16cid w16 w16cex w16sdtdh wp14">
   <w:footnote w:type="separator" w:id="-1">
@@ -2728,6 +2713,16 @@
 </file>
 
 <file path=word/header1.xml><?xml version="1.0" encoding="utf-8"?>
+<w:hdr xmlns:wpc="http://schemas.microsoft.com/office/word/2010/wordprocessingCanvas" xmlns:cx="http://schemas.microsoft.com/office/drawing/2014/chartex" xmlns:cx1="http://schemas.microsoft.com/office/drawing/2015/9/8/chartex" xmlns:cx2="http://schemas.microsoft.com/office/drawing/2015/10/21/chartex" xmlns:cx3="http://schemas.microsoft.com/office/drawing/2016/5/9/chartex" xmlns:cx4="http://schemas.microsoft.com/office/drawing/2016/5/10/chartex" xmlns:cx5="http://schemas.microsoft.com/office/drawing/2016/5/11/chartex" xmlns:cx6="http://schemas.microsoft.com/office/drawing/2016/5/12/chartex" xmlns:cx7="http://schemas.microsoft.com/office/drawing/2016/5/13/chartex" xmlns:cx8="http://schemas.microsoft.com/office/drawing/2016/5/14/chartex" xmlns:mc="http://schemas.openxmlformats.org/markup-compatibility/2006" xmlns:aink="http://schemas.microsoft.com/office/drawing/2016/ink" xmlns:am3d="http://schemas.microsoft.com/office/drawing/2017/model3d" xmlns:o="urn:schemas-microsoft-com:office:office" xmlns:r="http://schemas.openxmlformats.org/officeDocument/2006/relationships" xmlns:m="http://schemas.openxmlformats.org/officeDocument/2006/math" xmlns:v="urn:schemas-microsoft-com:vml" xmlns:wp14="http://schemas.microsoft.com/office/word/2010/wordprocessingDrawing" xmlns:wp="http://schemas.openxmlformats.org/drawingml/2006/wordprocessingDrawing" xmlns:w10="urn:schemas-microsoft-com:office:word" xmlns:w="http://schemas.openxmlformats.org/wordprocessingml/2006/main" xmlns:w14="http://schemas.microsoft.com/office/word/2010/wordml" xmlns:w15="http://schemas.microsoft.com/office/word/2012/wordml" xmlns:w16cex="http://schemas.microsoft.com/office/word/2018/wordml/cex" xmlns:w16cid="http://schemas.microsoft.com/office/word/2016/wordml/cid" xmlns:w16="http://schemas.microsoft.com/office/word/2018/wordml" xmlns:w16sdtdh="http://schemas.microsoft.com/office/word/2020/wordml/sdtdatahash" xmlns:w16se="http://schemas.microsoft.com/office/word/2015/wordml/symex" xmlns:wpg="http://schemas.microsoft.com/office/word/2010/wordprocessingGroup" xmlns:wpi="http://schemas.microsoft.com/office/word/2010/wordprocessingInk" xmlns:wne="http://schemas.microsoft.com/office/word/2006/wordml" xmlns:wps="http://schemas.microsoft.com/office/word/2010/wordprocessingShape" mc:Ignorable="w14 w15 w16se w16cid w16 w16cex w16sdtdh wp14">
+  <w:p>
+    <w:pPr>
+      <w:pStyle w:val="lfej"/>
+    </w:pPr>
+  </w:p>
+</w:hdr>
+</file>
+
+<file path=word/header2.xml><?xml version="1.0" encoding="utf-8"?>
 <w:hdr xmlns:wpc="http://schemas.microsoft.com/office/word/2010/wordprocessingCanvas" xmlns:cx="http://schemas.microsoft.com/office/drawing/2014/chartex" xmlns:cx1="http://schemas.microsoft.com/office/drawing/2015/9/8/chartex" xmlns:cx2="http://schemas.microsoft.com/office/drawing/2015/10/21/chartex" xmlns:cx3="http://schemas.microsoft.com/office/drawing/2016/5/9/chartex" xmlns:cx4="http://schemas.microsoft.com/office/drawing/2016/5/10/chartex" xmlns:cx5="http://schemas.microsoft.com/office/drawing/2016/5/11/chartex" xmlns:cx6="http://schemas.microsoft.com/office/drawing/2016/5/12/chartex" xmlns:cx7="http://schemas.microsoft.com/office/drawing/2016/5/13/chartex" xmlns:cx8="http://schemas.microsoft.com/office/drawing/2016/5/14/chartex" xmlns:mc="http://schemas.openxmlformats.org/markup-compatibility/2006" xmlns:aink="http://schemas.microsoft.com/office/drawing/2016/ink" xmlns:am3d="http://schemas.microsoft.com/office/drawing/2017/model3d" xmlns:o="urn:schemas-microsoft-com:office:office" xmlns:r="http://schemas.openxmlformats.org/officeDocument/2006/relationships" xmlns:m="http://schemas.openxmlformats.org/officeDocument/2006/math" xmlns:v="urn:schemas-microsoft-com:vml" xmlns:wp14="http://schemas.microsoft.com/office/word/2010/wordprocessingDrawing" xmlns:wp="http://schemas.openxmlformats.org/drawingml/2006/wordprocessingDrawing" xmlns:w10="urn:schemas-microsoft-com:office:word" xmlns:w="http://schemas.openxmlformats.org/wordprocessingml/2006/main" xmlns:w14="http://schemas.microsoft.com/office/word/2010/wordml" xmlns:w15="http://schemas.microsoft.com/office/word/2012/wordml" xmlns:w16cex="http://schemas.microsoft.com/office/word/2018/wordml/cex" xmlns:w16cid="http://schemas.microsoft.com/office/word/2016/wordml/cid" xmlns:w16="http://schemas.microsoft.com/office/word/2018/wordml" xmlns:w16sdtdh="http://schemas.microsoft.com/office/word/2020/wordml/sdtdatahash" xmlns:w16se="http://schemas.microsoft.com/office/word/2015/wordml/symex" xmlns:wpg="http://schemas.microsoft.com/office/word/2010/wordprocessingGroup" xmlns:wpi="http://schemas.microsoft.com/office/word/2010/wordprocessingInk" xmlns:wne="http://schemas.microsoft.com/office/word/2006/wordml" xmlns:wps="http://schemas.microsoft.com/office/word/2010/wordprocessingShape" mc:Ignorable="w14 w15 w16se w16cid w16 w16cex w16sdtdh wp14">
   <w:p>
     <w:pPr>
@@ -2791,11 +2786,21 @@
       <w:tab/>
     </w:r>
     <w:r>
-      <w:t>Tudástér s</w:t>
+      <w:t>S</w:t>
     </w:r>
     <w:r>
       <w:t>pecifikáció</w:t>
     </w:r>
+  </w:p>
+</w:hdr>
+</file>
+
+<file path=word/header3.xml><?xml version="1.0" encoding="utf-8"?>
+<w:hdr xmlns:wpc="http://schemas.microsoft.com/office/word/2010/wordprocessingCanvas" xmlns:cx="http://schemas.microsoft.com/office/drawing/2014/chartex" xmlns:cx1="http://schemas.microsoft.com/office/drawing/2015/9/8/chartex" xmlns:cx2="http://schemas.microsoft.com/office/drawing/2015/10/21/chartex" xmlns:cx3="http://schemas.microsoft.com/office/drawing/2016/5/9/chartex" xmlns:cx4="http://schemas.microsoft.com/office/drawing/2016/5/10/chartex" xmlns:cx5="http://schemas.microsoft.com/office/drawing/2016/5/11/chartex" xmlns:cx6="http://schemas.microsoft.com/office/drawing/2016/5/12/chartex" xmlns:cx7="http://schemas.microsoft.com/office/drawing/2016/5/13/chartex" xmlns:cx8="http://schemas.microsoft.com/office/drawing/2016/5/14/chartex" xmlns:mc="http://schemas.openxmlformats.org/markup-compatibility/2006" xmlns:aink="http://schemas.microsoft.com/office/drawing/2016/ink" xmlns:am3d="http://schemas.microsoft.com/office/drawing/2017/model3d" xmlns:o="urn:schemas-microsoft-com:office:office" xmlns:r="http://schemas.openxmlformats.org/officeDocument/2006/relationships" xmlns:m="http://schemas.openxmlformats.org/officeDocument/2006/math" xmlns:v="urn:schemas-microsoft-com:vml" xmlns:wp14="http://schemas.microsoft.com/office/word/2010/wordprocessingDrawing" xmlns:wp="http://schemas.openxmlformats.org/drawingml/2006/wordprocessingDrawing" xmlns:w10="urn:schemas-microsoft-com:office:word" xmlns:w="http://schemas.openxmlformats.org/wordprocessingml/2006/main" xmlns:w14="http://schemas.microsoft.com/office/word/2010/wordml" xmlns:w15="http://schemas.microsoft.com/office/word/2012/wordml" xmlns:w16cex="http://schemas.microsoft.com/office/word/2018/wordml/cex" xmlns:w16cid="http://schemas.microsoft.com/office/word/2016/wordml/cid" xmlns:w16="http://schemas.microsoft.com/office/word/2018/wordml" xmlns:w16sdtdh="http://schemas.microsoft.com/office/word/2020/wordml/sdtdatahash" xmlns:w16se="http://schemas.microsoft.com/office/word/2015/wordml/symex" xmlns:wpg="http://schemas.microsoft.com/office/word/2010/wordprocessingGroup" xmlns:wpi="http://schemas.microsoft.com/office/word/2010/wordprocessingInk" xmlns:wne="http://schemas.microsoft.com/office/word/2006/wordml" xmlns:wps="http://schemas.microsoft.com/office/word/2010/wordprocessingShape" mc:Ignorable="w14 w15 w16se w16cid w16 w16cex w16sdtdh wp14">
+  <w:p>
+    <w:pPr>
+      <w:pStyle w:val="lfej"/>
+    </w:pPr>
   </w:p>
 </w:hdr>
 </file>

</xml_diff>